<commit_message>
Added code to verify input array is not null or empty.
</commit_message>
<xml_diff>
--- a/CSC400_CT5_Screenshots_Algorithm_Analysis.docx
+++ b/CSC400_CT5_Screenshots_Algorithm_Analysis.docx
@@ -504,6 +504,7 @@
           <w:rFonts w:ascii="Times New Roman" w:hAnsi="Times New Roman" w:cs="Times New Roman"/>
           <w:b/>
           <w:bCs/>
+          <w:noProof/>
         </w:rPr>
         <w:drawing>
           <wp:inline distT="0" distB="0" distL="0" distR="0" wp14:anchorId="79403ED1" wp14:editId="1CBB89FE">
@@ -842,31 +843,7 @@
           <w:bCs/>
         </w:rPr>
         <w:lastRenderedPageBreak/>
-        <w:t xml:space="preserve">Bucket </w:t>
-      </w:r>
-      <w:r>
-        <w:rPr>
-          <w:rFonts w:ascii="Times New Roman" w:hAnsi="Times New Roman" w:cs="Times New Roman"/>
-          <w:b/>
-          <w:bCs/>
-        </w:rPr>
-        <w:t>3</w:t>
-      </w:r>
-      <w:r>
-        <w:rPr>
-          <w:rFonts w:ascii="Times New Roman" w:hAnsi="Times New Roman" w:cs="Times New Roman"/>
-          <w:b/>
-          <w:bCs/>
-        </w:rPr>
-        <w:t>:</w:t>
-      </w:r>
-      <w:r>
-        <w:rPr>
-          <w:rFonts w:ascii="Times New Roman" w:hAnsi="Times New Roman" w:cs="Times New Roman"/>
-          <w:b/>
-          <w:bCs/>
-        </w:rPr>
-        <w:t xml:space="preserve"> 783</w:t>
+        <w:t>Bucket 3: 783</w:t>
       </w:r>
       <w:r>
         <w:rPr>
@@ -897,23 +874,7 @@
           <w:b/>
           <w:bCs/>
         </w:rPr>
-        <w:t xml:space="preserve">Bucket </w:t>
-      </w:r>
-      <w:r>
-        <w:rPr>
-          <w:rFonts w:ascii="Times New Roman" w:hAnsi="Times New Roman" w:cs="Times New Roman"/>
-          <w:b/>
-          <w:bCs/>
-        </w:rPr>
-        <w:t>4</w:t>
-      </w:r>
-      <w:r>
-        <w:rPr>
-          <w:rFonts w:ascii="Times New Roman" w:hAnsi="Times New Roman" w:cs="Times New Roman"/>
-          <w:b/>
-          <w:bCs/>
-        </w:rPr>
-        <w:t>:</w:t>
+        <w:t>Bucket 4:</w:t>
       </w:r>
       <w:r>
         <w:rPr>
@@ -944,23 +905,7 @@
           <w:b/>
           <w:bCs/>
         </w:rPr>
-        <w:t xml:space="preserve">Bucket </w:t>
-      </w:r>
-      <w:r>
-        <w:rPr>
-          <w:rFonts w:ascii="Times New Roman" w:hAnsi="Times New Roman" w:cs="Times New Roman"/>
-          <w:b/>
-          <w:bCs/>
-        </w:rPr>
-        <w:t>5</w:t>
-      </w:r>
-      <w:r>
-        <w:rPr>
-          <w:rFonts w:ascii="Times New Roman" w:hAnsi="Times New Roman" w:cs="Times New Roman"/>
-          <w:b/>
-          <w:bCs/>
-        </w:rPr>
-        <w:t>:</w:t>
+        <w:t>Bucket 5:</w:t>
       </w:r>
       <w:r>
         <w:rPr>
@@ -991,23 +936,7 @@
           <w:b/>
           <w:bCs/>
         </w:rPr>
-        <w:t xml:space="preserve">Bucket </w:t>
-      </w:r>
-      <w:r>
-        <w:rPr>
-          <w:rFonts w:ascii="Times New Roman" w:hAnsi="Times New Roman" w:cs="Times New Roman"/>
-          <w:b/>
-          <w:bCs/>
-        </w:rPr>
-        <w:t>6</w:t>
-      </w:r>
-      <w:r>
-        <w:rPr>
-          <w:rFonts w:ascii="Times New Roman" w:hAnsi="Times New Roman" w:cs="Times New Roman"/>
-          <w:b/>
-          <w:bCs/>
-        </w:rPr>
-        <w:t>:</w:t>
+        <w:t>Bucket 6:</w:t>
       </w:r>
       <w:r>
         <w:rPr>
@@ -1038,7 +967,107 @@
           <w:b/>
           <w:bCs/>
         </w:rPr>
-        <w:t xml:space="preserve">Bucket </w:t>
+        <w:t>Bucket 7:</w:t>
+      </w:r>
+    </w:p>
+    <w:p>
+      <w:pPr>
+        <w:pStyle w:val="ListParagraph"/>
+        <w:numPr>
+          <w:ilvl w:val="0"/>
+          <w:numId w:val="4"/>
+        </w:numPr>
+        <w:spacing w:after="0" w:line="240" w:lineRule="auto"/>
+        <w:rPr>
+          <w:rFonts w:ascii="Times New Roman" w:hAnsi="Times New Roman" w:cs="Times New Roman"/>
+          <w:b/>
+          <w:bCs/>
+        </w:rPr>
+      </w:pPr>
+      <w:r>
+        <w:rPr>
+          <w:rFonts w:ascii="Times New Roman" w:hAnsi="Times New Roman" w:cs="Times New Roman"/>
+          <w:b/>
+          <w:bCs/>
+        </w:rPr>
+        <w:t>Bucket 8:</w:t>
+      </w:r>
+    </w:p>
+    <w:p>
+      <w:pPr>
+        <w:pStyle w:val="ListParagraph"/>
+        <w:numPr>
+          <w:ilvl w:val="0"/>
+          <w:numId w:val="4"/>
+        </w:numPr>
+        <w:spacing w:after="0" w:line="480" w:lineRule="auto"/>
+        <w:rPr>
+          <w:rFonts w:ascii="Times New Roman" w:hAnsi="Times New Roman" w:cs="Times New Roman"/>
+          <w:b/>
+          <w:bCs/>
+        </w:rPr>
+      </w:pPr>
+      <w:r>
+        <w:rPr>
+          <w:rFonts w:ascii="Times New Roman" w:hAnsi="Times New Roman" w:cs="Times New Roman"/>
+          <w:b/>
+          <w:bCs/>
+        </w:rPr>
+        <w:t>Bucket 9: 9</w:t>
+      </w:r>
+      <w:r>
+        <w:rPr>
+          <w:rFonts w:ascii="Times New Roman" w:hAnsi="Times New Roman" w:cs="Times New Roman"/>
+          <w:b/>
+          <w:bCs/>
+        </w:rPr>
+        <w:t>9</w:t>
+      </w:r>
+    </w:p>
+    <w:p>
+      <w:pPr>
+        <w:pStyle w:val="ListParagraph"/>
+        <w:numPr>
+          <w:ilvl w:val="0"/>
+          <w:numId w:val="3"/>
+        </w:numPr>
+        <w:spacing w:after="0" w:line="240" w:lineRule="auto"/>
+        <w:rPr>
+          <w:rFonts w:ascii="Times New Roman" w:hAnsi="Times New Roman" w:cs="Times New Roman"/>
+          <w:b/>
+          <w:bCs/>
+        </w:rPr>
+      </w:pPr>
+      <w:r>
+        <w:rPr>
+          <w:rFonts w:ascii="Times New Roman" w:hAnsi="Times New Roman" w:cs="Times New Roman"/>
+          <w:b/>
+          <w:bCs/>
+        </w:rPr>
+        <w:t>Iterate through each bucket (starting at bucket 0) and fill original array:</w:t>
+      </w:r>
+    </w:p>
+    <w:p>
+      <w:pPr>
+        <w:pStyle w:val="ListParagraph"/>
+        <w:numPr>
+          <w:ilvl w:val="0"/>
+          <w:numId w:val="6"/>
+        </w:numPr>
+        <w:spacing w:after="0" w:line="480" w:lineRule="auto"/>
+        <w:rPr>
+          <w:rFonts w:ascii="Times New Roman" w:hAnsi="Times New Roman" w:cs="Times New Roman"/>
+          <w:b/>
+          <w:bCs/>
+        </w:rPr>
+      </w:pPr>
+      <w:r>
+        <w:rPr>
+          <w:rFonts w:ascii="Times New Roman" w:hAnsi="Times New Roman" w:cs="Times New Roman"/>
+          <w:b/>
+          <w:bCs/>
+        </w:rPr>
+        <w:t xml:space="preserve">New values of array: 491, 472, 182, 692, </w:t>
       </w:r>
       <w:r>
         <w:rPr>
@@ -1054,15 +1083,15 @@
           <w:b/>
           <w:bCs/>
         </w:rPr>
-        <w:t>:</w:t>
-      </w:r>
-    </w:p>
-    <w:p>
-      <w:pPr>
-        <w:pStyle w:val="ListParagraph"/>
-        <w:numPr>
-          <w:ilvl w:val="0"/>
-          <w:numId w:val="4"/>
+        <w:t>83, 543, 264, 94, 295, 356, 99</w:t>
+      </w:r>
+    </w:p>
+    <w:p>
+      <w:pPr>
+        <w:pStyle w:val="ListParagraph"/>
+        <w:numPr>
+          <w:ilvl w:val="0"/>
+          <w:numId w:val="3"/>
         </w:numPr>
         <w:spacing w:after="0" w:line="240" w:lineRule="auto"/>
         <w:rPr>
@@ -1077,31 +1106,26 @@
           <w:b/>
           <w:bCs/>
         </w:rPr>
-        <w:t xml:space="preserve">Bucket </w:t>
-      </w:r>
-      <w:r>
-        <w:rPr>
-          <w:rFonts w:ascii="Times New Roman" w:hAnsi="Times New Roman" w:cs="Times New Roman"/>
-          <w:b/>
-          <w:bCs/>
-        </w:rPr>
-        <w:t>8</w:t>
-      </w:r>
-      <w:r>
-        <w:rPr>
-          <w:rFonts w:ascii="Times New Roman" w:hAnsi="Times New Roman" w:cs="Times New Roman"/>
-          <w:b/>
-          <w:bCs/>
-        </w:rPr>
-        <w:t>:</w:t>
-      </w:r>
-    </w:p>
-    <w:p>
-      <w:pPr>
-        <w:pStyle w:val="ListParagraph"/>
-        <w:numPr>
-          <w:ilvl w:val="0"/>
-          <w:numId w:val="4"/>
+        <w:t>Iterate through each bucket and clear all values to prepare for next digit comparison.</w:t>
+      </w:r>
+    </w:p>
+    <w:p>
+      <w:pPr>
+        <w:pStyle w:val="ListParagraph"/>
+        <w:spacing w:after="0" w:line="240" w:lineRule="auto"/>
+        <w:rPr>
+          <w:rFonts w:ascii="Times New Roman" w:hAnsi="Times New Roman" w:cs="Times New Roman"/>
+          <w:b/>
+          <w:bCs/>
+        </w:rPr>
+      </w:pPr>
+    </w:p>
+    <w:p>
+      <w:pPr>
+        <w:pStyle w:val="ListParagraph"/>
+        <w:numPr>
+          <w:ilvl w:val="0"/>
+          <w:numId w:val="3"/>
         </w:numPr>
         <w:spacing w:after="0" w:line="480" w:lineRule="auto"/>
         <w:rPr>
@@ -1116,15 +1140,7 @@
           <w:b/>
           <w:bCs/>
         </w:rPr>
-        <w:t>Bucket 9: 9</w:t>
-      </w:r>
-      <w:r>
-        <w:rPr>
-          <w:rFonts w:ascii="Times New Roman" w:hAnsi="Times New Roman" w:cs="Times New Roman"/>
-          <w:b/>
-          <w:bCs/>
-        </w:rPr>
-        <w:t>9</w:t>
+        <w:t>Set multiplier to check for next least significant digit.</w:t>
       </w:r>
     </w:p>
     <w:p>
@@ -1147,6 +1163,331 @@
           <w:b/>
           <w:bCs/>
         </w:rPr>
+        <w:t>Second iteration of elements in array:</w:t>
+      </w:r>
+    </w:p>
+    <w:p>
+      <w:pPr>
+        <w:pStyle w:val="ListParagraph"/>
+        <w:numPr>
+          <w:ilvl w:val="0"/>
+          <w:numId w:val="7"/>
+        </w:numPr>
+        <w:spacing w:after="0" w:line="240" w:lineRule="auto"/>
+        <w:rPr>
+          <w:rFonts w:ascii="Times New Roman" w:hAnsi="Times New Roman" w:cs="Times New Roman"/>
+          <w:b/>
+          <w:bCs/>
+        </w:rPr>
+      </w:pPr>
+      <w:r>
+        <w:rPr>
+          <w:rFonts w:ascii="Times New Roman" w:hAnsi="Times New Roman" w:cs="Times New Roman"/>
+          <w:b/>
+          <w:bCs/>
+        </w:rPr>
+        <w:t>Bucket 0:</w:t>
+      </w:r>
+      <w:r>
+        <w:rPr>
+          <w:rFonts w:ascii="Times New Roman" w:hAnsi="Times New Roman" w:cs="Times New Roman"/>
+          <w:b/>
+          <w:bCs/>
+        </w:rPr>
+        <w:t xml:space="preserve"> </w:t>
+      </w:r>
+    </w:p>
+    <w:p>
+      <w:pPr>
+        <w:pStyle w:val="ListParagraph"/>
+        <w:numPr>
+          <w:ilvl w:val="0"/>
+          <w:numId w:val="7"/>
+        </w:numPr>
+        <w:spacing w:after="0" w:line="240" w:lineRule="auto"/>
+        <w:rPr>
+          <w:rFonts w:ascii="Times New Roman" w:hAnsi="Times New Roman" w:cs="Times New Roman"/>
+          <w:b/>
+          <w:bCs/>
+        </w:rPr>
+      </w:pPr>
+      <w:r>
+        <w:rPr>
+          <w:rFonts w:ascii="Times New Roman" w:hAnsi="Times New Roman" w:cs="Times New Roman"/>
+          <w:b/>
+          <w:bCs/>
+        </w:rPr>
+        <w:t xml:space="preserve">Bucket 1: </w:t>
+      </w:r>
+    </w:p>
+    <w:p>
+      <w:pPr>
+        <w:pStyle w:val="ListParagraph"/>
+        <w:numPr>
+          <w:ilvl w:val="0"/>
+          <w:numId w:val="7"/>
+        </w:numPr>
+        <w:spacing w:after="0" w:line="240" w:lineRule="auto"/>
+        <w:rPr>
+          <w:rFonts w:ascii="Times New Roman" w:hAnsi="Times New Roman" w:cs="Times New Roman"/>
+          <w:b/>
+          <w:bCs/>
+        </w:rPr>
+      </w:pPr>
+      <w:r>
+        <w:rPr>
+          <w:rFonts w:ascii="Times New Roman" w:hAnsi="Times New Roman" w:cs="Times New Roman"/>
+          <w:b/>
+          <w:bCs/>
+        </w:rPr>
+        <w:t xml:space="preserve">Bucket 2: </w:t>
+      </w:r>
+    </w:p>
+    <w:p>
+      <w:pPr>
+        <w:pStyle w:val="ListParagraph"/>
+        <w:numPr>
+          <w:ilvl w:val="0"/>
+          <w:numId w:val="7"/>
+        </w:numPr>
+        <w:spacing w:after="0" w:line="240" w:lineRule="auto"/>
+        <w:rPr>
+          <w:rFonts w:ascii="Times New Roman" w:hAnsi="Times New Roman" w:cs="Times New Roman"/>
+          <w:b/>
+          <w:bCs/>
+        </w:rPr>
+      </w:pPr>
+      <w:r>
+        <w:rPr>
+          <w:rFonts w:ascii="Times New Roman" w:hAnsi="Times New Roman" w:cs="Times New Roman"/>
+          <w:b/>
+          <w:bCs/>
+        </w:rPr>
+        <w:t xml:space="preserve">Bucket 3: </w:t>
+      </w:r>
+    </w:p>
+    <w:p>
+      <w:pPr>
+        <w:pStyle w:val="ListParagraph"/>
+        <w:numPr>
+          <w:ilvl w:val="0"/>
+          <w:numId w:val="7"/>
+        </w:numPr>
+        <w:spacing w:after="0" w:line="240" w:lineRule="auto"/>
+        <w:rPr>
+          <w:rFonts w:ascii="Times New Roman" w:hAnsi="Times New Roman" w:cs="Times New Roman"/>
+          <w:b/>
+          <w:bCs/>
+        </w:rPr>
+      </w:pPr>
+      <w:r>
+        <w:rPr>
+          <w:rFonts w:ascii="Times New Roman" w:hAnsi="Times New Roman" w:cs="Times New Roman"/>
+          <w:b/>
+          <w:bCs/>
+        </w:rPr>
+        <w:t xml:space="preserve">Bucket 4: </w:t>
+      </w:r>
+      <w:r>
+        <w:rPr>
+          <w:rFonts w:ascii="Times New Roman" w:hAnsi="Times New Roman" w:cs="Times New Roman"/>
+          <w:b/>
+          <w:bCs/>
+        </w:rPr>
+        <w:t>543</w:t>
+      </w:r>
+    </w:p>
+    <w:p>
+      <w:pPr>
+        <w:pStyle w:val="ListParagraph"/>
+        <w:numPr>
+          <w:ilvl w:val="0"/>
+          <w:numId w:val="7"/>
+        </w:numPr>
+        <w:spacing w:after="0" w:line="240" w:lineRule="auto"/>
+        <w:rPr>
+          <w:rFonts w:ascii="Times New Roman" w:hAnsi="Times New Roman" w:cs="Times New Roman"/>
+          <w:b/>
+          <w:bCs/>
+        </w:rPr>
+      </w:pPr>
+      <w:r>
+        <w:rPr>
+          <w:rFonts w:ascii="Times New Roman" w:hAnsi="Times New Roman" w:cs="Times New Roman"/>
+          <w:b/>
+          <w:bCs/>
+        </w:rPr>
+        <w:t xml:space="preserve">Bucket 5: </w:t>
+      </w:r>
+      <w:r>
+        <w:rPr>
+          <w:rFonts w:ascii="Times New Roman" w:hAnsi="Times New Roman" w:cs="Times New Roman"/>
+          <w:b/>
+          <w:bCs/>
+        </w:rPr>
+        <w:t>356</w:t>
+      </w:r>
+    </w:p>
+    <w:p>
+      <w:pPr>
+        <w:pStyle w:val="ListParagraph"/>
+        <w:numPr>
+          <w:ilvl w:val="0"/>
+          <w:numId w:val="7"/>
+        </w:numPr>
+        <w:spacing w:after="0" w:line="240" w:lineRule="auto"/>
+        <w:rPr>
+          <w:rFonts w:ascii="Times New Roman" w:hAnsi="Times New Roman" w:cs="Times New Roman"/>
+          <w:b/>
+          <w:bCs/>
+        </w:rPr>
+      </w:pPr>
+      <w:r>
+        <w:rPr>
+          <w:rFonts w:ascii="Times New Roman" w:hAnsi="Times New Roman" w:cs="Times New Roman"/>
+          <w:b/>
+          <w:bCs/>
+        </w:rPr>
+        <w:t xml:space="preserve">Bucket 6: </w:t>
+      </w:r>
+      <w:r>
+        <w:rPr>
+          <w:rFonts w:ascii="Times New Roman" w:hAnsi="Times New Roman" w:cs="Times New Roman"/>
+          <w:b/>
+          <w:bCs/>
+        </w:rPr>
+        <w:t>264</w:t>
+      </w:r>
+    </w:p>
+    <w:p>
+      <w:pPr>
+        <w:pStyle w:val="ListParagraph"/>
+        <w:numPr>
+          <w:ilvl w:val="0"/>
+          <w:numId w:val="7"/>
+        </w:numPr>
+        <w:spacing w:after="0" w:line="240" w:lineRule="auto"/>
+        <w:rPr>
+          <w:rFonts w:ascii="Times New Roman" w:hAnsi="Times New Roman" w:cs="Times New Roman"/>
+          <w:b/>
+          <w:bCs/>
+        </w:rPr>
+      </w:pPr>
+      <w:r>
+        <w:rPr>
+          <w:rFonts w:ascii="Times New Roman" w:hAnsi="Times New Roman" w:cs="Times New Roman"/>
+          <w:b/>
+          <w:bCs/>
+        </w:rPr>
+        <w:t>Bucket 7:</w:t>
+      </w:r>
+      <w:r>
+        <w:rPr>
+          <w:rFonts w:ascii="Times New Roman" w:hAnsi="Times New Roman" w:cs="Times New Roman"/>
+          <w:b/>
+          <w:bCs/>
+        </w:rPr>
+        <w:t xml:space="preserve"> 472</w:t>
+      </w:r>
+    </w:p>
+    <w:p>
+      <w:pPr>
+        <w:pStyle w:val="ListParagraph"/>
+        <w:numPr>
+          <w:ilvl w:val="0"/>
+          <w:numId w:val="7"/>
+        </w:numPr>
+        <w:spacing w:after="0" w:line="240" w:lineRule="auto"/>
+        <w:rPr>
+          <w:rFonts w:ascii="Times New Roman" w:hAnsi="Times New Roman" w:cs="Times New Roman"/>
+          <w:b/>
+          <w:bCs/>
+        </w:rPr>
+      </w:pPr>
+      <w:r>
+        <w:rPr>
+          <w:rFonts w:ascii="Times New Roman" w:hAnsi="Times New Roman" w:cs="Times New Roman"/>
+          <w:b/>
+          <w:bCs/>
+        </w:rPr>
+        <w:t>Bucket 8:</w:t>
+      </w:r>
+      <w:r>
+        <w:rPr>
+          <w:rFonts w:ascii="Times New Roman" w:hAnsi="Times New Roman" w:cs="Times New Roman"/>
+          <w:b/>
+          <w:bCs/>
+        </w:rPr>
+        <w:t xml:space="preserve"> 182, </w:t>
+      </w:r>
+      <w:r>
+        <w:rPr>
+          <w:rFonts w:ascii="Times New Roman" w:hAnsi="Times New Roman" w:cs="Times New Roman"/>
+          <w:b/>
+          <w:bCs/>
+        </w:rPr>
+        <w:t>7</w:t>
+      </w:r>
+      <w:r>
+        <w:rPr>
+          <w:rFonts w:ascii="Times New Roman" w:hAnsi="Times New Roman" w:cs="Times New Roman"/>
+          <w:b/>
+          <w:bCs/>
+        </w:rPr>
+        <w:t xml:space="preserve">83, </w:t>
+      </w:r>
+    </w:p>
+    <w:p>
+      <w:pPr>
+        <w:pStyle w:val="ListParagraph"/>
+        <w:numPr>
+          <w:ilvl w:val="0"/>
+          <w:numId w:val="7"/>
+        </w:numPr>
+        <w:spacing w:after="0" w:line="480" w:lineRule="auto"/>
+        <w:rPr>
+          <w:rFonts w:ascii="Times New Roman" w:hAnsi="Times New Roman" w:cs="Times New Roman"/>
+          <w:b/>
+          <w:bCs/>
+        </w:rPr>
+      </w:pPr>
+      <w:r>
+        <w:rPr>
+          <w:rFonts w:ascii="Times New Roman" w:hAnsi="Times New Roman" w:cs="Times New Roman"/>
+          <w:b/>
+          <w:bCs/>
+        </w:rPr>
+        <w:t xml:space="preserve">Bucket 9: </w:t>
+      </w:r>
+      <w:r>
+        <w:rPr>
+          <w:rFonts w:ascii="Times New Roman" w:hAnsi="Times New Roman" w:cs="Times New Roman"/>
+          <w:b/>
+          <w:bCs/>
+        </w:rPr>
+        <w:t>491, 692 94, 295, 99</w:t>
+      </w:r>
+    </w:p>
+    <w:p>
+      <w:pPr>
+        <w:pStyle w:val="ListParagraph"/>
+        <w:numPr>
+          <w:ilvl w:val="0"/>
+          <w:numId w:val="3"/>
+        </w:numPr>
+        <w:spacing w:line="240" w:lineRule="auto"/>
+        <w:rPr>
+          <w:rFonts w:ascii="Times New Roman" w:hAnsi="Times New Roman" w:cs="Times New Roman"/>
+          <w:b/>
+          <w:bCs/>
+        </w:rPr>
+      </w:pPr>
+      <w:r>
+        <w:rPr>
+          <w:rFonts w:ascii="Times New Roman" w:hAnsi="Times New Roman" w:cs="Times New Roman"/>
+          <w:b/>
+          <w:bCs/>
+        </w:rPr>
         <w:t>Iterate through each bucket (starting at bucket 0) and fill original array:</w:t>
       </w:r>
     </w:p>
@@ -1155,7 +1496,88 @@
         <w:pStyle w:val="ListParagraph"/>
         <w:numPr>
           <w:ilvl w:val="0"/>
-          <w:numId w:val="6"/>
+          <w:numId w:val="9"/>
+        </w:numPr>
+        <w:spacing w:line="480" w:lineRule="auto"/>
+        <w:rPr>
+          <w:rFonts w:ascii="Times New Roman" w:hAnsi="Times New Roman" w:cs="Times New Roman"/>
+          <w:b/>
+          <w:bCs/>
+        </w:rPr>
+      </w:pPr>
+      <w:r>
+        <w:rPr>
+          <w:rFonts w:ascii="Times New Roman" w:hAnsi="Times New Roman" w:cs="Times New Roman"/>
+          <w:b/>
+          <w:bCs/>
+        </w:rPr>
+        <w:t xml:space="preserve">New values of array: </w:t>
+      </w:r>
+      <w:r>
+        <w:rPr>
+          <w:rFonts w:ascii="Times New Roman" w:hAnsi="Times New Roman" w:cs="Times New Roman"/>
+          <w:b/>
+          <w:bCs/>
+        </w:rPr>
+        <w:t xml:space="preserve">543, 356, 264, 472, 182, </w:t>
+      </w:r>
+      <w:r>
+        <w:rPr>
+          <w:rFonts w:ascii="Times New Roman" w:hAnsi="Times New Roman" w:cs="Times New Roman"/>
+          <w:b/>
+          <w:bCs/>
+        </w:rPr>
+        <w:t>7</w:t>
+      </w:r>
+      <w:r>
+        <w:rPr>
+          <w:rFonts w:ascii="Times New Roman" w:hAnsi="Times New Roman" w:cs="Times New Roman"/>
+          <w:b/>
+          <w:bCs/>
+        </w:rPr>
+        <w:t>83, 491, 692, 94, 295, 99</w:t>
+      </w:r>
+    </w:p>
+    <w:p>
+      <w:pPr>
+        <w:pStyle w:val="ListParagraph"/>
+        <w:numPr>
+          <w:ilvl w:val="0"/>
+          <w:numId w:val="3"/>
+        </w:numPr>
+        <w:spacing w:line="240" w:lineRule="auto"/>
+        <w:rPr>
+          <w:rFonts w:ascii="Times New Roman" w:hAnsi="Times New Roman" w:cs="Times New Roman"/>
+          <w:b/>
+          <w:bCs/>
+        </w:rPr>
+      </w:pPr>
+      <w:r>
+        <w:rPr>
+          <w:rFonts w:ascii="Times New Roman" w:hAnsi="Times New Roman" w:cs="Times New Roman"/>
+          <w:b/>
+          <w:bCs/>
+        </w:rPr>
+        <w:t>Iterate through each bucket and clear all values to prepare for next digit comparison.</w:t>
+      </w:r>
+    </w:p>
+    <w:p>
+      <w:pPr>
+        <w:pStyle w:val="ListParagraph"/>
+        <w:spacing w:line="240" w:lineRule="auto"/>
+        <w:rPr>
+          <w:rFonts w:ascii="Times New Roman" w:hAnsi="Times New Roman" w:cs="Times New Roman"/>
+          <w:b/>
+          <w:bCs/>
+        </w:rPr>
+      </w:pPr>
+    </w:p>
+    <w:p>
+      <w:pPr>
+        <w:pStyle w:val="ListParagraph"/>
+        <w:numPr>
+          <w:ilvl w:val="0"/>
+          <w:numId w:val="3"/>
         </w:numPr>
         <w:spacing w:after="0" w:line="480" w:lineRule="auto"/>
         <w:rPr>
@@ -1170,23 +1592,7 @@
           <w:b/>
           <w:bCs/>
         </w:rPr>
-        <w:t xml:space="preserve">New values of array: 491, 472, 182, 692, </w:t>
-      </w:r>
-      <w:r>
-        <w:rPr>
-          <w:rFonts w:ascii="Times New Roman" w:hAnsi="Times New Roman" w:cs="Times New Roman"/>
-          <w:b/>
-          <w:bCs/>
-        </w:rPr>
-        <w:t>7</w:t>
-      </w:r>
-      <w:r>
-        <w:rPr>
-          <w:rFonts w:ascii="Times New Roman" w:hAnsi="Times New Roman" w:cs="Times New Roman"/>
-          <w:b/>
-          <w:bCs/>
-        </w:rPr>
-        <w:t>83, 543, 264, 94, 295, 356, 99</w:t>
+        <w:t>Set multiplier to check for next least significant digit.</w:t>
       </w:r>
     </w:p>
     <w:p>
@@ -1209,12 +1615,16 @@
           <w:b/>
           <w:bCs/>
         </w:rPr>
-        <w:t>Iterate through each bucket and clear all values to prepare for next digit comparison.</w:t>
-      </w:r>
-    </w:p>
-    <w:p>
-      <w:pPr>
-        <w:pStyle w:val="ListParagraph"/>
+        <w:t>Third iteration of elements in array:</w:t>
+      </w:r>
+    </w:p>
+    <w:p>
+      <w:pPr>
+        <w:pStyle w:val="ListParagraph"/>
+        <w:numPr>
+          <w:ilvl w:val="0"/>
+          <w:numId w:val="7"/>
+        </w:numPr>
         <w:spacing w:after="0" w:line="240" w:lineRule="auto"/>
         <w:rPr>
           <w:rFonts w:ascii="Times New Roman" w:hAnsi="Times New Roman" w:cs="Times New Roman"/>
@@ -1222,36 +1632,21 @@
           <w:bCs/>
         </w:rPr>
       </w:pPr>
-    </w:p>
-    <w:p>
-      <w:pPr>
-        <w:pStyle w:val="ListParagraph"/>
-        <w:numPr>
-          <w:ilvl w:val="0"/>
-          <w:numId w:val="3"/>
-        </w:numPr>
-        <w:spacing w:after="0" w:line="480" w:lineRule="auto"/>
-        <w:rPr>
-          <w:rFonts w:ascii="Times New Roman" w:hAnsi="Times New Roman" w:cs="Times New Roman"/>
-          <w:b/>
-          <w:bCs/>
-        </w:rPr>
-      </w:pPr>
-      <w:r>
-        <w:rPr>
-          <w:rFonts w:ascii="Times New Roman" w:hAnsi="Times New Roman" w:cs="Times New Roman"/>
-          <w:b/>
-          <w:bCs/>
-        </w:rPr>
-        <w:t>Set multiplier to check for next least significant digit.</w:t>
-      </w:r>
-    </w:p>
-    <w:p>
-      <w:pPr>
-        <w:pStyle w:val="ListParagraph"/>
-        <w:numPr>
-          <w:ilvl w:val="0"/>
-          <w:numId w:val="3"/>
+      <w:r>
+        <w:rPr>
+          <w:rFonts w:ascii="Times New Roman" w:hAnsi="Times New Roman" w:cs="Times New Roman"/>
+          <w:b/>
+          <w:bCs/>
+        </w:rPr>
+        <w:t>Bucket 0: 94, 99</w:t>
+      </w:r>
+    </w:p>
+    <w:p>
+      <w:pPr>
+        <w:pStyle w:val="ListParagraph"/>
+        <w:numPr>
+          <w:ilvl w:val="0"/>
+          <w:numId w:val="7"/>
         </w:numPr>
         <w:spacing w:after="0" w:line="240" w:lineRule="auto"/>
         <w:rPr>
@@ -1266,15 +1661,7 @@
           <w:b/>
           <w:bCs/>
         </w:rPr>
-        <w:t>Second</w:t>
-      </w:r>
-      <w:r>
-        <w:rPr>
-          <w:rFonts w:ascii="Times New Roman" w:hAnsi="Times New Roman" w:cs="Times New Roman"/>
-          <w:b/>
-          <w:bCs/>
-        </w:rPr>
-        <w:t xml:space="preserve"> iteration of elements in array:</w:t>
+        <w:t>Bucket 1: 182</w:t>
       </w:r>
     </w:p>
     <w:p>
@@ -1297,15 +1684,7 @@
           <w:b/>
           <w:bCs/>
         </w:rPr>
-        <w:t>Bucket 0:</w:t>
-      </w:r>
-      <w:r>
-        <w:rPr>
-          <w:rFonts w:ascii="Times New Roman" w:hAnsi="Times New Roman" w:cs="Times New Roman"/>
-          <w:b/>
-          <w:bCs/>
-        </w:rPr>
-        <w:t xml:space="preserve"> </w:t>
+        <w:t>Bucket 2: 264, 295</w:t>
       </w:r>
     </w:p>
     <w:p>
@@ -1328,7 +1707,7 @@
           <w:b/>
           <w:bCs/>
         </w:rPr>
-        <w:t xml:space="preserve">Bucket 1: </w:t>
+        <w:t>Bucket 3: 356</w:t>
       </w:r>
     </w:p>
     <w:p>
@@ -1351,7 +1730,7 @@
           <w:b/>
           <w:bCs/>
         </w:rPr>
-        <w:t xml:space="preserve">Bucket 2: </w:t>
+        <w:t>Bucket 4: 472, 491</w:t>
       </w:r>
     </w:p>
     <w:p>
@@ -1374,7 +1753,7 @@
           <w:b/>
           <w:bCs/>
         </w:rPr>
-        <w:t xml:space="preserve">Bucket 3: </w:t>
+        <w:t>Bucket 5: 543</w:t>
       </w:r>
     </w:p>
     <w:p>
@@ -1397,561 +1776,7 @@
           <w:b/>
           <w:bCs/>
         </w:rPr>
-        <w:t xml:space="preserve">Bucket 4: </w:t>
-      </w:r>
-      <w:r>
-        <w:rPr>
-          <w:rFonts w:ascii="Times New Roman" w:hAnsi="Times New Roman" w:cs="Times New Roman"/>
-          <w:b/>
-          <w:bCs/>
-        </w:rPr>
-        <w:t>543</w:t>
-      </w:r>
-    </w:p>
-    <w:p>
-      <w:pPr>
-        <w:pStyle w:val="ListParagraph"/>
-        <w:numPr>
-          <w:ilvl w:val="0"/>
-          <w:numId w:val="7"/>
-        </w:numPr>
-        <w:spacing w:after="0" w:line="240" w:lineRule="auto"/>
-        <w:rPr>
-          <w:rFonts w:ascii="Times New Roman" w:hAnsi="Times New Roman" w:cs="Times New Roman"/>
-          <w:b/>
-          <w:bCs/>
-        </w:rPr>
-      </w:pPr>
-      <w:r>
-        <w:rPr>
-          <w:rFonts w:ascii="Times New Roman" w:hAnsi="Times New Roman" w:cs="Times New Roman"/>
-          <w:b/>
-          <w:bCs/>
-        </w:rPr>
-        <w:t xml:space="preserve">Bucket 5: </w:t>
-      </w:r>
-      <w:r>
-        <w:rPr>
-          <w:rFonts w:ascii="Times New Roman" w:hAnsi="Times New Roman" w:cs="Times New Roman"/>
-          <w:b/>
-          <w:bCs/>
-        </w:rPr>
-        <w:t>356</w:t>
-      </w:r>
-    </w:p>
-    <w:p>
-      <w:pPr>
-        <w:pStyle w:val="ListParagraph"/>
-        <w:numPr>
-          <w:ilvl w:val="0"/>
-          <w:numId w:val="7"/>
-        </w:numPr>
-        <w:spacing w:after="0" w:line="240" w:lineRule="auto"/>
-        <w:rPr>
-          <w:rFonts w:ascii="Times New Roman" w:hAnsi="Times New Roman" w:cs="Times New Roman"/>
-          <w:b/>
-          <w:bCs/>
-        </w:rPr>
-      </w:pPr>
-      <w:r>
-        <w:rPr>
-          <w:rFonts w:ascii="Times New Roman" w:hAnsi="Times New Roman" w:cs="Times New Roman"/>
-          <w:b/>
-          <w:bCs/>
-        </w:rPr>
-        <w:t xml:space="preserve">Bucket 6: </w:t>
-      </w:r>
-      <w:r>
-        <w:rPr>
-          <w:rFonts w:ascii="Times New Roman" w:hAnsi="Times New Roman" w:cs="Times New Roman"/>
-          <w:b/>
-          <w:bCs/>
-        </w:rPr>
-        <w:t>264</w:t>
-      </w:r>
-    </w:p>
-    <w:p>
-      <w:pPr>
-        <w:pStyle w:val="ListParagraph"/>
-        <w:numPr>
-          <w:ilvl w:val="0"/>
-          <w:numId w:val="7"/>
-        </w:numPr>
-        <w:spacing w:after="0" w:line="240" w:lineRule="auto"/>
-        <w:rPr>
-          <w:rFonts w:ascii="Times New Roman" w:hAnsi="Times New Roman" w:cs="Times New Roman"/>
-          <w:b/>
-          <w:bCs/>
-        </w:rPr>
-      </w:pPr>
-      <w:r>
-        <w:rPr>
-          <w:rFonts w:ascii="Times New Roman" w:hAnsi="Times New Roman" w:cs="Times New Roman"/>
-          <w:b/>
-          <w:bCs/>
-        </w:rPr>
-        <w:t>Bucket 7:</w:t>
-      </w:r>
-      <w:r>
-        <w:rPr>
-          <w:rFonts w:ascii="Times New Roman" w:hAnsi="Times New Roman" w:cs="Times New Roman"/>
-          <w:b/>
-          <w:bCs/>
-        </w:rPr>
-        <w:t xml:space="preserve"> 472</w:t>
-      </w:r>
-    </w:p>
-    <w:p>
-      <w:pPr>
-        <w:pStyle w:val="ListParagraph"/>
-        <w:numPr>
-          <w:ilvl w:val="0"/>
-          <w:numId w:val="7"/>
-        </w:numPr>
-        <w:spacing w:after="0" w:line="240" w:lineRule="auto"/>
-        <w:rPr>
-          <w:rFonts w:ascii="Times New Roman" w:hAnsi="Times New Roman" w:cs="Times New Roman"/>
-          <w:b/>
-          <w:bCs/>
-        </w:rPr>
-      </w:pPr>
-      <w:r>
-        <w:rPr>
-          <w:rFonts w:ascii="Times New Roman" w:hAnsi="Times New Roman" w:cs="Times New Roman"/>
-          <w:b/>
-          <w:bCs/>
-        </w:rPr>
-        <w:t>Bucket 8:</w:t>
-      </w:r>
-      <w:r>
-        <w:rPr>
-          <w:rFonts w:ascii="Times New Roman" w:hAnsi="Times New Roman" w:cs="Times New Roman"/>
-          <w:b/>
-          <w:bCs/>
-        </w:rPr>
-        <w:t xml:space="preserve"> 182, </w:t>
-      </w:r>
-      <w:r>
-        <w:rPr>
-          <w:rFonts w:ascii="Times New Roman" w:hAnsi="Times New Roman" w:cs="Times New Roman"/>
-          <w:b/>
-          <w:bCs/>
-        </w:rPr>
-        <w:t>7</w:t>
-      </w:r>
-      <w:r>
-        <w:rPr>
-          <w:rFonts w:ascii="Times New Roman" w:hAnsi="Times New Roman" w:cs="Times New Roman"/>
-          <w:b/>
-          <w:bCs/>
-        </w:rPr>
-        <w:t xml:space="preserve">83, </w:t>
-      </w:r>
-    </w:p>
-    <w:p>
-      <w:pPr>
-        <w:pStyle w:val="ListParagraph"/>
-        <w:numPr>
-          <w:ilvl w:val="0"/>
-          <w:numId w:val="7"/>
-        </w:numPr>
-        <w:spacing w:after="0" w:line="480" w:lineRule="auto"/>
-        <w:rPr>
-          <w:rFonts w:ascii="Times New Roman" w:hAnsi="Times New Roman" w:cs="Times New Roman"/>
-          <w:b/>
-          <w:bCs/>
-        </w:rPr>
-      </w:pPr>
-      <w:r>
-        <w:rPr>
-          <w:rFonts w:ascii="Times New Roman" w:hAnsi="Times New Roman" w:cs="Times New Roman"/>
-          <w:b/>
-          <w:bCs/>
-        </w:rPr>
-        <w:t xml:space="preserve">Bucket 9: </w:t>
-      </w:r>
-      <w:r>
-        <w:rPr>
-          <w:rFonts w:ascii="Times New Roman" w:hAnsi="Times New Roman" w:cs="Times New Roman"/>
-          <w:b/>
-          <w:bCs/>
-        </w:rPr>
-        <w:t>491, 692 94, 295, 99</w:t>
-      </w:r>
-    </w:p>
-    <w:p>
-      <w:pPr>
-        <w:pStyle w:val="ListParagraph"/>
-        <w:numPr>
-          <w:ilvl w:val="0"/>
-          <w:numId w:val="3"/>
-        </w:numPr>
-        <w:spacing w:line="240" w:lineRule="auto"/>
-        <w:rPr>
-          <w:rFonts w:ascii="Times New Roman" w:hAnsi="Times New Roman" w:cs="Times New Roman"/>
-          <w:b/>
-          <w:bCs/>
-        </w:rPr>
-      </w:pPr>
-      <w:r>
-        <w:rPr>
-          <w:rFonts w:ascii="Times New Roman" w:hAnsi="Times New Roman" w:cs="Times New Roman"/>
-          <w:b/>
-          <w:bCs/>
-        </w:rPr>
-        <w:t>Iterate through each bucket (starting at bucket 0) and fill original array:</w:t>
-      </w:r>
-    </w:p>
-    <w:p>
-      <w:pPr>
-        <w:pStyle w:val="ListParagraph"/>
-        <w:numPr>
-          <w:ilvl w:val="0"/>
-          <w:numId w:val="9"/>
-        </w:numPr>
-        <w:spacing w:line="480" w:lineRule="auto"/>
-        <w:rPr>
-          <w:rFonts w:ascii="Times New Roman" w:hAnsi="Times New Roman" w:cs="Times New Roman"/>
-          <w:b/>
-          <w:bCs/>
-        </w:rPr>
-      </w:pPr>
-      <w:r>
-        <w:rPr>
-          <w:rFonts w:ascii="Times New Roman" w:hAnsi="Times New Roman" w:cs="Times New Roman"/>
-          <w:b/>
-          <w:bCs/>
-        </w:rPr>
-        <w:t xml:space="preserve">New values of array: </w:t>
-      </w:r>
-      <w:r>
-        <w:rPr>
-          <w:rFonts w:ascii="Times New Roman" w:hAnsi="Times New Roman" w:cs="Times New Roman"/>
-          <w:b/>
-          <w:bCs/>
-        </w:rPr>
-        <w:t xml:space="preserve">543, 356, 264, 472, 182, </w:t>
-      </w:r>
-      <w:r>
-        <w:rPr>
-          <w:rFonts w:ascii="Times New Roman" w:hAnsi="Times New Roman" w:cs="Times New Roman"/>
-          <w:b/>
-          <w:bCs/>
-        </w:rPr>
-        <w:t>7</w:t>
-      </w:r>
-      <w:r>
-        <w:rPr>
-          <w:rFonts w:ascii="Times New Roman" w:hAnsi="Times New Roman" w:cs="Times New Roman"/>
-          <w:b/>
-          <w:bCs/>
-        </w:rPr>
-        <w:t>83, 491, 692, 94, 295, 99</w:t>
-      </w:r>
-    </w:p>
-    <w:p>
-      <w:pPr>
-        <w:pStyle w:val="ListParagraph"/>
-        <w:numPr>
-          <w:ilvl w:val="0"/>
-          <w:numId w:val="3"/>
-        </w:numPr>
-        <w:spacing w:line="240" w:lineRule="auto"/>
-        <w:rPr>
-          <w:rFonts w:ascii="Times New Roman" w:hAnsi="Times New Roman" w:cs="Times New Roman"/>
-          <w:b/>
-          <w:bCs/>
-        </w:rPr>
-      </w:pPr>
-      <w:r>
-        <w:rPr>
-          <w:rFonts w:ascii="Times New Roman" w:hAnsi="Times New Roman" w:cs="Times New Roman"/>
-          <w:b/>
-          <w:bCs/>
-        </w:rPr>
-        <w:t>Iterate through each bucket and clear all values to prepare for next digit comparison.</w:t>
-      </w:r>
-    </w:p>
-    <w:p>
-      <w:pPr>
-        <w:pStyle w:val="ListParagraph"/>
-        <w:spacing w:line="240" w:lineRule="auto"/>
-        <w:rPr>
-          <w:rFonts w:ascii="Times New Roman" w:hAnsi="Times New Roman" w:cs="Times New Roman"/>
-          <w:b/>
-          <w:bCs/>
-        </w:rPr>
-      </w:pPr>
-    </w:p>
-    <w:p>
-      <w:pPr>
-        <w:pStyle w:val="ListParagraph"/>
-        <w:numPr>
-          <w:ilvl w:val="0"/>
-          <w:numId w:val="3"/>
-        </w:numPr>
-        <w:spacing w:after="0" w:line="480" w:lineRule="auto"/>
-        <w:rPr>
-          <w:rFonts w:ascii="Times New Roman" w:hAnsi="Times New Roman" w:cs="Times New Roman"/>
-          <w:b/>
-          <w:bCs/>
-        </w:rPr>
-      </w:pPr>
-      <w:r>
-        <w:rPr>
-          <w:rFonts w:ascii="Times New Roman" w:hAnsi="Times New Roman" w:cs="Times New Roman"/>
-          <w:b/>
-          <w:bCs/>
-        </w:rPr>
-        <w:t>Set multiplier to check for next least significant digit.</w:t>
-      </w:r>
-    </w:p>
-    <w:p>
-      <w:pPr>
-        <w:pStyle w:val="ListParagraph"/>
-        <w:numPr>
-          <w:ilvl w:val="0"/>
-          <w:numId w:val="3"/>
-        </w:numPr>
-        <w:spacing w:after="0" w:line="240" w:lineRule="auto"/>
-        <w:rPr>
-          <w:rFonts w:ascii="Times New Roman" w:hAnsi="Times New Roman" w:cs="Times New Roman"/>
-          <w:b/>
-          <w:bCs/>
-        </w:rPr>
-      </w:pPr>
-      <w:r>
-        <w:rPr>
-          <w:rFonts w:ascii="Times New Roman" w:hAnsi="Times New Roman" w:cs="Times New Roman"/>
-          <w:b/>
-          <w:bCs/>
-        </w:rPr>
-        <w:t>Third</w:t>
-      </w:r>
-      <w:r>
-        <w:rPr>
-          <w:rFonts w:ascii="Times New Roman" w:hAnsi="Times New Roman" w:cs="Times New Roman"/>
-          <w:b/>
-          <w:bCs/>
-        </w:rPr>
-        <w:t xml:space="preserve"> iteration of elements in array:</w:t>
-      </w:r>
-    </w:p>
-    <w:p>
-      <w:pPr>
-        <w:pStyle w:val="ListParagraph"/>
-        <w:numPr>
-          <w:ilvl w:val="0"/>
-          <w:numId w:val="7"/>
-        </w:numPr>
-        <w:spacing w:after="0" w:line="240" w:lineRule="auto"/>
-        <w:rPr>
-          <w:rFonts w:ascii="Times New Roman" w:hAnsi="Times New Roman" w:cs="Times New Roman"/>
-          <w:b/>
-          <w:bCs/>
-        </w:rPr>
-      </w:pPr>
-      <w:r>
-        <w:rPr>
-          <w:rFonts w:ascii="Times New Roman" w:hAnsi="Times New Roman" w:cs="Times New Roman"/>
-          <w:b/>
-          <w:bCs/>
-        </w:rPr>
-        <w:t xml:space="preserve">Bucket 0: </w:t>
-      </w:r>
-      <w:r>
-        <w:rPr>
-          <w:rFonts w:ascii="Times New Roman" w:hAnsi="Times New Roman" w:cs="Times New Roman"/>
-          <w:b/>
-          <w:bCs/>
-        </w:rPr>
-        <w:t>94, 99</w:t>
-      </w:r>
-    </w:p>
-    <w:p>
-      <w:pPr>
-        <w:pStyle w:val="ListParagraph"/>
-        <w:numPr>
-          <w:ilvl w:val="0"/>
-          <w:numId w:val="7"/>
-        </w:numPr>
-        <w:spacing w:after="0" w:line="240" w:lineRule="auto"/>
-        <w:rPr>
-          <w:rFonts w:ascii="Times New Roman" w:hAnsi="Times New Roman" w:cs="Times New Roman"/>
-          <w:b/>
-          <w:bCs/>
-        </w:rPr>
-      </w:pPr>
-      <w:r>
-        <w:rPr>
-          <w:rFonts w:ascii="Times New Roman" w:hAnsi="Times New Roman" w:cs="Times New Roman"/>
-          <w:b/>
-          <w:bCs/>
-        </w:rPr>
-        <w:t xml:space="preserve">Bucket 1: </w:t>
-      </w:r>
-      <w:r>
-        <w:rPr>
-          <w:rFonts w:ascii="Times New Roman" w:hAnsi="Times New Roman" w:cs="Times New Roman"/>
-          <w:b/>
-          <w:bCs/>
-        </w:rPr>
-        <w:t>182</w:t>
-      </w:r>
-    </w:p>
-    <w:p>
-      <w:pPr>
-        <w:pStyle w:val="ListParagraph"/>
-        <w:numPr>
-          <w:ilvl w:val="0"/>
-          <w:numId w:val="7"/>
-        </w:numPr>
-        <w:spacing w:after="0" w:line="240" w:lineRule="auto"/>
-        <w:rPr>
-          <w:rFonts w:ascii="Times New Roman" w:hAnsi="Times New Roman" w:cs="Times New Roman"/>
-          <w:b/>
-          <w:bCs/>
-        </w:rPr>
-      </w:pPr>
-      <w:r>
-        <w:rPr>
-          <w:rFonts w:ascii="Times New Roman" w:hAnsi="Times New Roman" w:cs="Times New Roman"/>
-          <w:b/>
-          <w:bCs/>
-        </w:rPr>
-        <w:t xml:space="preserve">Bucket 2: </w:t>
-      </w:r>
-      <w:r>
-        <w:rPr>
-          <w:rFonts w:ascii="Times New Roman" w:hAnsi="Times New Roman" w:cs="Times New Roman"/>
-          <w:b/>
-          <w:bCs/>
-        </w:rPr>
-        <w:t>264, 295</w:t>
-      </w:r>
-    </w:p>
-    <w:p>
-      <w:pPr>
-        <w:pStyle w:val="ListParagraph"/>
-        <w:numPr>
-          <w:ilvl w:val="0"/>
-          <w:numId w:val="7"/>
-        </w:numPr>
-        <w:spacing w:after="0" w:line="240" w:lineRule="auto"/>
-        <w:rPr>
-          <w:rFonts w:ascii="Times New Roman" w:hAnsi="Times New Roman" w:cs="Times New Roman"/>
-          <w:b/>
-          <w:bCs/>
-        </w:rPr>
-      </w:pPr>
-      <w:r>
-        <w:rPr>
-          <w:rFonts w:ascii="Times New Roman" w:hAnsi="Times New Roman" w:cs="Times New Roman"/>
-          <w:b/>
-          <w:bCs/>
-        </w:rPr>
-        <w:t>Bucket 3:</w:t>
-      </w:r>
-      <w:r>
-        <w:rPr>
-          <w:rFonts w:ascii="Times New Roman" w:hAnsi="Times New Roman" w:cs="Times New Roman"/>
-          <w:b/>
-          <w:bCs/>
-        </w:rPr>
-        <w:t xml:space="preserve"> 356</w:t>
-      </w:r>
-    </w:p>
-    <w:p>
-      <w:pPr>
-        <w:pStyle w:val="ListParagraph"/>
-        <w:numPr>
-          <w:ilvl w:val="0"/>
-          <w:numId w:val="7"/>
-        </w:numPr>
-        <w:spacing w:after="0" w:line="240" w:lineRule="auto"/>
-        <w:rPr>
-          <w:rFonts w:ascii="Times New Roman" w:hAnsi="Times New Roman" w:cs="Times New Roman"/>
-          <w:b/>
-          <w:bCs/>
-        </w:rPr>
-      </w:pPr>
-      <w:r>
-        <w:rPr>
-          <w:rFonts w:ascii="Times New Roman" w:hAnsi="Times New Roman" w:cs="Times New Roman"/>
-          <w:b/>
-          <w:bCs/>
-        </w:rPr>
-        <w:t xml:space="preserve">Bucket 4: </w:t>
-      </w:r>
-      <w:r>
-        <w:rPr>
-          <w:rFonts w:ascii="Times New Roman" w:hAnsi="Times New Roman" w:cs="Times New Roman"/>
-          <w:b/>
-          <w:bCs/>
-        </w:rPr>
-        <w:t>472, 491</w:t>
-      </w:r>
-    </w:p>
-    <w:p>
-      <w:pPr>
-        <w:pStyle w:val="ListParagraph"/>
-        <w:numPr>
-          <w:ilvl w:val="0"/>
-          <w:numId w:val="7"/>
-        </w:numPr>
-        <w:spacing w:after="0" w:line="240" w:lineRule="auto"/>
-        <w:rPr>
-          <w:rFonts w:ascii="Times New Roman" w:hAnsi="Times New Roman" w:cs="Times New Roman"/>
-          <w:b/>
-          <w:bCs/>
-        </w:rPr>
-      </w:pPr>
-      <w:r>
-        <w:rPr>
-          <w:rFonts w:ascii="Times New Roman" w:hAnsi="Times New Roman" w:cs="Times New Roman"/>
-          <w:b/>
-          <w:bCs/>
-        </w:rPr>
-        <w:t xml:space="preserve">Bucket 5: </w:t>
-      </w:r>
-      <w:r>
-        <w:rPr>
-          <w:rFonts w:ascii="Times New Roman" w:hAnsi="Times New Roman" w:cs="Times New Roman"/>
-          <w:b/>
-          <w:bCs/>
-        </w:rPr>
-        <w:t>543</w:t>
-      </w:r>
-    </w:p>
-    <w:p>
-      <w:pPr>
-        <w:pStyle w:val="ListParagraph"/>
-        <w:numPr>
-          <w:ilvl w:val="0"/>
-          <w:numId w:val="7"/>
-        </w:numPr>
-        <w:spacing w:after="0" w:line="240" w:lineRule="auto"/>
-        <w:rPr>
-          <w:rFonts w:ascii="Times New Roman" w:hAnsi="Times New Roman" w:cs="Times New Roman"/>
-          <w:b/>
-          <w:bCs/>
-        </w:rPr>
-      </w:pPr>
-      <w:r>
-        <w:rPr>
-          <w:rFonts w:ascii="Times New Roman" w:hAnsi="Times New Roman" w:cs="Times New Roman"/>
-          <w:b/>
-          <w:bCs/>
-        </w:rPr>
-        <w:t xml:space="preserve">Bucket 6: </w:t>
-      </w:r>
-      <w:r>
-        <w:rPr>
-          <w:rFonts w:ascii="Times New Roman" w:hAnsi="Times New Roman" w:cs="Times New Roman"/>
-          <w:b/>
-          <w:bCs/>
-        </w:rPr>
-        <w:t>692</w:t>
+        <w:t>Bucket 6: 692</w:t>
       </w:r>
     </w:p>
     <w:p>
@@ -2313,8 +2138,153 @@
         </w:drawing>
       </w:r>
     </w:p>
+    <w:p>
+      <w:pPr>
+        <w:spacing w:after="0" w:line="480" w:lineRule="auto"/>
+        <w:jc w:val="center"/>
+        <w:rPr>
+          <w:rFonts w:ascii="Times New Roman" w:hAnsi="Times New Roman" w:cs="Times New Roman"/>
+          <w:b/>
+          <w:bCs/>
+        </w:rPr>
+      </w:pPr>
+      <w:r>
+        <w:rPr>
+          <w:rFonts w:ascii="Times New Roman" w:hAnsi="Times New Roman" w:cs="Times New Roman"/>
+          <w:b/>
+          <w:bCs/>
+        </w:rPr>
+        <w:lastRenderedPageBreak/>
+        <w:t>GIT Repository Screenshot</w:t>
+      </w:r>
+    </w:p>
+    <w:p>
+      <w:pPr>
+        <w:spacing w:after="0" w:line="480" w:lineRule="auto"/>
+        <w:jc w:val="center"/>
+        <w:rPr>
+          <w:rFonts w:ascii="Times New Roman" w:hAnsi="Times New Roman" w:cs="Times New Roman"/>
+          <w:b/>
+          <w:bCs/>
+        </w:rPr>
+      </w:pPr>
+      <w:r>
+        <w:rPr>
+          <w:rFonts w:ascii="Times New Roman" w:hAnsi="Times New Roman" w:cs="Times New Roman"/>
+          <w:b/>
+          <w:bCs/>
+        </w:rPr>
+        <w:drawing>
+          <wp:inline distT="0" distB="0" distL="0" distR="0" wp14:anchorId="3008448D" wp14:editId="7E2524FC">
+            <wp:extent cx="5943600" cy="3342005"/>
+            <wp:effectExtent l="0" t="0" r="0" b="0"/>
+            <wp:docPr id="1010999355" name="Picture 1" descr="A screenshot of a computer&#10;&#10;AI-generated content may be incorrect."/>
+            <wp:cNvGraphicFramePr>
+              <a:graphicFrameLocks xmlns:a="http://schemas.openxmlformats.org/drawingml/2006/main" noChangeAspect="1"/>
+            </wp:cNvGraphicFramePr>
+            <a:graphic xmlns:a="http://schemas.openxmlformats.org/drawingml/2006/main">
+              <a:graphicData uri="http://schemas.openxmlformats.org/drawingml/2006/picture">
+                <pic:pic xmlns:pic="http://schemas.openxmlformats.org/drawingml/2006/picture">
+                  <pic:nvPicPr>
+                    <pic:cNvPr id="1010999355" name="Picture 1" descr="A screenshot of a computer&#10;&#10;AI-generated content may be incorrect."/>
+                    <pic:cNvPicPr/>
+                  </pic:nvPicPr>
+                  <pic:blipFill>
+                    <a:blip r:embed="rId9"/>
+                    <a:stretch>
+                      <a:fillRect/>
+                    </a:stretch>
+                  </pic:blipFill>
+                  <pic:spPr>
+                    <a:xfrm>
+                      <a:off x="0" y="0"/>
+                      <a:ext cx="5943600" cy="3342005"/>
+                    </a:xfrm>
+                    <a:prstGeom prst="rect">
+                      <a:avLst/>
+                    </a:prstGeom>
+                  </pic:spPr>
+                </pic:pic>
+              </a:graphicData>
+            </a:graphic>
+          </wp:inline>
+        </w:drawing>
+      </w:r>
+    </w:p>
+    <w:p>
+      <w:pPr>
+        <w:spacing w:after="0" w:line="480" w:lineRule="auto"/>
+        <w:jc w:val="center"/>
+        <w:rPr>
+          <w:rFonts w:ascii="Times New Roman" w:hAnsi="Times New Roman" w:cs="Times New Roman"/>
+          <w:b/>
+          <w:bCs/>
+        </w:rPr>
+      </w:pPr>
+      <w:r>
+        <w:rPr>
+          <w:rFonts w:ascii="Times New Roman" w:hAnsi="Times New Roman" w:cs="Times New Roman"/>
+          <w:b/>
+          <w:bCs/>
+        </w:rPr>
+        <w:t>GitHub Repository Screenshot</w:t>
+      </w:r>
+    </w:p>
+    <w:p>
+      <w:pPr>
+        <w:spacing w:after="0" w:line="480" w:lineRule="auto"/>
+        <w:jc w:val="center"/>
+        <w:rPr>
+          <w:rFonts w:ascii="Times New Roman" w:hAnsi="Times New Roman" w:cs="Times New Roman"/>
+          <w:b/>
+          <w:bCs/>
+        </w:rPr>
+      </w:pPr>
+      <w:r>
+        <w:rPr>
+          <w:rFonts w:ascii="Times New Roman" w:hAnsi="Times New Roman" w:cs="Times New Roman"/>
+          <w:b/>
+          <w:bCs/>
+        </w:rPr>
+        <w:drawing>
+          <wp:inline distT="0" distB="0" distL="0" distR="0" wp14:anchorId="2209C0E7" wp14:editId="4AE2823C">
+            <wp:extent cx="5943600" cy="3342005"/>
+            <wp:effectExtent l="0" t="0" r="0" b="0"/>
+            <wp:docPr id="2076753459" name="Picture 1" descr="A computer screen shot of a computer&#10;&#10;AI-generated content may be incorrect."/>
+            <wp:cNvGraphicFramePr>
+              <a:graphicFrameLocks xmlns:a="http://schemas.openxmlformats.org/drawingml/2006/main" noChangeAspect="1"/>
+            </wp:cNvGraphicFramePr>
+            <a:graphic xmlns:a="http://schemas.openxmlformats.org/drawingml/2006/main">
+              <a:graphicData uri="http://schemas.openxmlformats.org/drawingml/2006/picture">
+                <pic:pic xmlns:pic="http://schemas.openxmlformats.org/drawingml/2006/picture">
+                  <pic:nvPicPr>
+                    <pic:cNvPr id="2076753459" name="Picture 1" descr="A computer screen shot of a computer&#10;&#10;AI-generated content may be incorrect."/>
+                    <pic:cNvPicPr/>
+                  </pic:nvPicPr>
+                  <pic:blipFill>
+                    <a:blip r:embed="rId10"/>
+                    <a:stretch>
+                      <a:fillRect/>
+                    </a:stretch>
+                  </pic:blipFill>
+                  <pic:spPr>
+                    <a:xfrm>
+                      <a:off x="0" y="0"/>
+                      <a:ext cx="5943600" cy="3342005"/>
+                    </a:xfrm>
+                    <a:prstGeom prst="rect">
+                      <a:avLst/>
+                    </a:prstGeom>
+                  </pic:spPr>
+                </pic:pic>
+              </a:graphicData>
+            </a:graphic>
+          </wp:inline>
+        </w:drawing>
+      </w:r>
+    </w:p>
     <w:sectPr>
-      <w:headerReference w:type="default" r:id="rId9"/>
+      <w:headerReference w:type="default" r:id="rId11"/>
       <w:pgSz w:w="12240" w:h="15840"/>
       <w:pgMar w:top="1440" w:right="1440" w:bottom="1440" w:left="1440" w:header="720" w:footer="720" w:gutter="0"/>
       <w:cols w:space="720"/>
@@ -4075,6 +4045,7 @@
   <w:style w:type="character" w:default="1" w:styleId="DefaultParagraphFont">
     <w:name w:val="Default Paragraph Font"/>
     <w:uiPriority w:val="1"/>
+    <w:semiHidden/>
     <w:unhideWhenUsed/>
   </w:style>
   <w:style w:type="table" w:default="1" w:styleId="TableNormal">

</xml_diff>